<commit_message>
ya van 25 paginas de documento auxilio
</commit_message>
<xml_diff>
--- a/data/WORD/Esquema BD EPSAndes.docx
+++ b/data/WORD/Esquema BD EPSAndes.docx
@@ -5,7 +5,7 @@
     <w:p>
       <w:pPr>
         <w:pStyle w:val="Heading1"/>
-        <w:spacing w:before="0" w:after="100" w:afterAutospacing="1"/>
+        <w:spacing w:before="0" w:after="0"/>
         <w:jc w:val="center"/>
       </w:pPr>
       <w:r>
@@ -1088,15 +1088,7 @@
                 <w:sz w:val="21"/>
                 <w:szCs w:val="22"/>
               </w:rPr>
-              <w:t>F</w:t>
-            </w:r>
-            <w:r>
-              <w:rPr>
-                <w:noProof/>
-                <w:sz w:val="21"/>
-                <w:szCs w:val="22"/>
-              </w:rPr>
-              <w:t>K</w:t>
+              <w:t>FK</w:t>
             </w:r>
             <w:r>
               <w:rPr>
@@ -1489,25 +1481,7 @@
                 <w:sz w:val="21"/>
                 <w:szCs w:val="22"/>
               </w:rPr>
-              <w:t xml:space="preserve">, </w:t>
-            </w:r>
-            <w:bookmarkStart w:id="0" w:name="_GoBack"/>
-            <w:r>
-              <w:rPr>
-                <w:noProof/>
-                <w:sz w:val="21"/>
-                <w:szCs w:val="22"/>
-              </w:rPr>
-              <w:t>CK</w:t>
-            </w:r>
-            <w:bookmarkEnd w:id="0"/>
-            <w:r>
-              <w:rPr>
-                <w:noProof/>
-                <w:sz w:val="21"/>
-                <w:szCs w:val="22"/>
-              </w:rPr>
-              <w:t>(IN(“</w:t>
+              <w:t>, CK(IN(“</w:t>
             </w:r>
             <w:r>
               <w:rPr>
@@ -5296,16 +5270,7 @@
                 <w:szCs w:val="22"/>
                 <w:vertAlign w:val="subscript"/>
               </w:rPr>
-              <w:t>Campania</w:t>
-            </w:r>
-            <w:r>
-              <w:rPr>
-                <w:noProof/>
-                <w:sz w:val="21"/>
-                <w:szCs w:val="22"/>
-                <w:vertAlign w:val="subscript"/>
-              </w:rPr>
-              <w:t>.id</w:t>
+              <w:t>Campania.id</w:t>
             </w:r>
           </w:p>
         </w:tc>
@@ -5329,15 +5294,16 @@
     <w:tbl>
       <w:tblPr>
         <w:tblStyle w:val="TableGrid"/>
-        <w:tblW w:w="0" w:type="auto"/>
+        <w:tblW w:w="10313" w:type="dxa"/>
         <w:tblLook w:val="04A0" w:firstRow="1" w:lastRow="0" w:firstColumn="1" w:lastColumn="0" w:noHBand="0" w:noVBand="1"/>
       </w:tblPr>
       <w:tblGrid>
-        <w:gridCol w:w="1931"/>
-        <w:gridCol w:w="2060"/>
-        <w:gridCol w:w="1477"/>
-        <w:gridCol w:w="1161"/>
-        <w:gridCol w:w="1842"/>
+        <w:gridCol w:w="2059"/>
+        <w:gridCol w:w="2198"/>
+        <w:gridCol w:w="1576"/>
+        <w:gridCol w:w="1239"/>
+        <w:gridCol w:w="1965"/>
+        <w:gridCol w:w="1276"/>
       </w:tblGrid>
       <w:tr>
         <w:trPr>
@@ -5493,6 +5459,36 @@
             </w:r>
           </w:p>
         </w:tc>
+        <w:tc>
+          <w:tcPr>
+            <w:tcW w:w="0" w:type="auto"/>
+            <w:shd w:val="clear" w:color="auto" w:fill="8DB3E2" w:themeFill="text2" w:themeFillTint="66"/>
+          </w:tcPr>
+          <w:p>
+            <w:pPr>
+              <w:pStyle w:val="NoSpacing"/>
+              <w:spacing w:before="60" w:after="60"/>
+              <w:jc w:val="center"/>
+              <w:rPr>
+                <w:b/>
+                <w:bCs/>
+                <w:noProof/>
+                <w:sz w:val="21"/>
+                <w:szCs w:val="22"/>
+              </w:rPr>
+            </w:pPr>
+            <w:r>
+              <w:rPr>
+                <w:b/>
+                <w:bCs/>
+                <w:noProof/>
+                <w:sz w:val="21"/>
+                <w:szCs w:val="22"/>
+              </w:rPr>
+              <w:t>campania</w:t>
+            </w:r>
+          </w:p>
+        </w:tc>
       </w:tr>
       <w:tr>
         <w:trPr>
@@ -5628,6 +5624,32 @@
             </w:r>
           </w:p>
         </w:tc>
+        <w:tc>
+          <w:tcPr>
+            <w:tcW w:w="0" w:type="auto"/>
+            <w:shd w:val="clear" w:color="auto" w:fill="B8CCE4" w:themeFill="accent1" w:themeFillTint="66"/>
+          </w:tcPr>
+          <w:p>
+            <w:pPr>
+              <w:pStyle w:val="NoSpacing"/>
+              <w:spacing w:before="60" w:after="60"/>
+              <w:jc w:val="center"/>
+              <w:rPr>
+                <w:noProof/>
+                <w:sz w:val="21"/>
+                <w:szCs w:val="22"/>
+              </w:rPr>
+            </w:pPr>
+            <w:r>
+              <w:rPr>
+                <w:noProof/>
+                <w:sz w:val="21"/>
+                <w:szCs w:val="22"/>
+              </w:rPr>
+              <w:t>Number</w:t>
+            </w:r>
+          </w:p>
+        </w:tc>
       </w:tr>
       <w:tr>
         <w:trPr>
@@ -5824,6 +5846,41 @@
                 <w:vertAlign w:val="subscript"/>
               </w:rPr>
               <w:t>numDoc</w:t>
+            </w:r>
+          </w:p>
+        </w:tc>
+        <w:tc>
+          <w:tcPr>
+            <w:tcW w:w="0" w:type="auto"/>
+            <w:shd w:val="clear" w:color="auto" w:fill="FBD4B4" w:themeFill="accent6" w:themeFillTint="66"/>
+          </w:tcPr>
+          <w:p>
+            <w:pPr>
+              <w:pStyle w:val="NoSpacing"/>
+              <w:spacing w:before="60" w:after="60"/>
+              <w:jc w:val="center"/>
+              <w:rPr>
+                <w:noProof/>
+                <w:sz w:val="21"/>
+                <w:szCs w:val="22"/>
+              </w:rPr>
+            </w:pPr>
+            <w:r>
+              <w:rPr>
+                <w:noProof/>
+                <w:sz w:val="21"/>
+                <w:szCs w:val="22"/>
+              </w:rPr>
+              <w:t>FK</w:t>
+            </w:r>
+            <w:r>
+              <w:rPr>
+                <w:noProof/>
+                <w:sz w:val="21"/>
+                <w:szCs w:val="22"/>
+                <w:vertAlign w:val="subscript"/>
+              </w:rPr>
+              <w:t>Campania.id</w:t>
             </w:r>
           </w:p>
         </w:tc>
@@ -5854,6 +5911,7 @@
         <w:gridCol w:w="1908"/>
         <w:gridCol w:w="1208"/>
         <w:gridCol w:w="998"/>
+        <w:gridCol w:w="1313"/>
       </w:tblGrid>
       <w:tr>
         <w:trPr>
@@ -6005,17 +6063,37 @@
                 <w:sz w:val="21"/>
                 <w:szCs w:val="22"/>
               </w:rPr>
-              <w:t>fecha</w:t>
-            </w:r>
-            <w:r>
-              <w:rPr>
-                <w:b/>
-                <w:bCs/>
-                <w:noProof/>
-                <w:sz w:val="21"/>
-                <w:szCs w:val="22"/>
-              </w:rPr>
-              <w:t>Fin</w:t>
+              <w:t>fechaFin</w:t>
+            </w:r>
+          </w:p>
+        </w:tc>
+        <w:tc>
+          <w:tcPr>
+            <w:tcW w:w="0" w:type="auto"/>
+            <w:shd w:val="clear" w:color="auto" w:fill="8DB3E2" w:themeFill="text2" w:themeFillTint="66"/>
+          </w:tcPr>
+          <w:p>
+            <w:pPr>
+              <w:pStyle w:val="NoSpacing"/>
+              <w:spacing w:before="60" w:after="60"/>
+              <w:jc w:val="center"/>
+              <w:rPr>
+                <w:b/>
+                <w:bCs/>
+                <w:noProof/>
+                <w:sz w:val="21"/>
+                <w:szCs w:val="22"/>
+              </w:rPr>
+            </w:pPr>
+            <w:r>
+              <w:rPr>
+                <w:b/>
+                <w:bCs/>
+                <w:noProof/>
+                <w:sz w:val="21"/>
+                <w:szCs w:val="22"/>
+              </w:rPr>
+              <w:t>organizador</w:t>
             </w:r>
           </w:p>
         </w:tc>
@@ -6154,6 +6232,32 @@
             </w:r>
           </w:p>
         </w:tc>
+        <w:tc>
+          <w:tcPr>
+            <w:tcW w:w="0" w:type="auto"/>
+            <w:shd w:val="clear" w:color="auto" w:fill="B8CCE4" w:themeFill="accent1" w:themeFillTint="66"/>
+          </w:tcPr>
+          <w:p>
+            <w:pPr>
+              <w:pStyle w:val="NoSpacing"/>
+              <w:spacing w:before="60" w:after="60"/>
+              <w:jc w:val="center"/>
+              <w:rPr>
+                <w:noProof/>
+                <w:sz w:val="21"/>
+                <w:szCs w:val="22"/>
+              </w:rPr>
+            </w:pPr>
+            <w:r>
+              <w:rPr>
+                <w:noProof/>
+                <w:sz w:val="21"/>
+                <w:szCs w:val="22"/>
+              </w:rPr>
+              <w:t>Number</w:t>
+            </w:r>
+          </w:p>
+        </w:tc>
       </w:tr>
       <w:tr>
         <w:trPr>
@@ -6288,6 +6392,50 @@
                 <w:szCs w:val="22"/>
               </w:rPr>
               <w:t>NN</w:t>
+            </w:r>
+          </w:p>
+        </w:tc>
+        <w:tc>
+          <w:tcPr>
+            <w:tcW w:w="0" w:type="auto"/>
+            <w:shd w:val="clear" w:color="auto" w:fill="FBD4B4" w:themeFill="accent6" w:themeFillTint="66"/>
+          </w:tcPr>
+          <w:p>
+            <w:pPr>
+              <w:pStyle w:val="NoSpacing"/>
+              <w:spacing w:before="60" w:after="60"/>
+              <w:jc w:val="center"/>
+              <w:rPr>
+                <w:noProof/>
+                <w:sz w:val="21"/>
+                <w:szCs w:val="22"/>
+              </w:rPr>
+            </w:pPr>
+            <w:r>
+              <w:rPr>
+                <w:noProof/>
+                <w:sz w:val="21"/>
+                <w:szCs w:val="22"/>
+              </w:rPr>
+              <w:t>FK</w:t>
+            </w:r>
+            <w:r>
+              <w:rPr>
+                <w:noProof/>
+                <w:sz w:val="21"/>
+                <w:szCs w:val="22"/>
+                <w:vertAlign w:val="subscript"/>
+              </w:rPr>
+              <w:t>Usuarios</w:t>
+            </w:r>
+            <w:r>
+              <w:rPr>
+                <w:noProof/>
+                <w:sz w:val="21"/>
+                <w:szCs w:val="22"/>
+                <w:vertAlign w:val="subscript"/>
+              </w:rPr>
+              <w:t>.id</w:t>
             </w:r>
           </w:p>
         </w:tc>
@@ -6678,7 +6826,18 @@
         </w:tc>
       </w:tr>
     </w:tbl>
-    <w:p/>
+    <w:p>
+      <w:pPr>
+        <w:spacing w:before="0" w:after="0"/>
+        <w:jc w:val="left"/>
+        <w:rPr>
+          <w:sz w:val="20"/>
+          <w:szCs w:val="20"/>
+        </w:rPr>
+      </w:pPr>
+      <w:bookmarkStart w:id="0" w:name="_GoBack"/>
+      <w:bookmarkEnd w:id="0"/>
+    </w:p>
     <w:sectPr>
       <w:pgSz w:w="12240" w:h="15840"/>
       <w:pgMar w:top="1440" w:right="1440" w:bottom="1440" w:left="1440" w:header="708" w:footer="708" w:gutter="0"/>
@@ -6687,6 +6846,56 @@
     </w:sectPr>
   </w:body>
 </w:document>
+</file>
+
+<file path=word/endnotes.xml><?xml version="1.0" encoding="utf-8"?>
+<w:endnotes xmlns:wpc="http://schemas.microsoft.com/office/word/2010/wordprocessingCanvas" xmlns:cx="http://schemas.microsoft.com/office/drawing/2014/chartex" xmlns:cx1="http://schemas.microsoft.com/office/drawing/2015/9/8/chartex" xmlns:cx2="http://schemas.microsoft.com/office/drawing/2015/10/21/chartex" xmlns:cx3="http://schemas.microsoft.com/office/drawing/2016/5/9/chartex" xmlns:cx4="http://schemas.microsoft.com/office/drawing/2016/5/10/chartex" xmlns:cx5="http://schemas.microsoft.com/office/drawing/2016/5/11/chartex" xmlns:cx6="http://schemas.microsoft.com/office/drawing/2016/5/12/chartex" xmlns:cx7="http://schemas.microsoft.com/office/drawing/2016/5/13/chartex" xmlns:cx8="http://schemas.microsoft.com/office/drawing/2016/5/14/chartex" xmlns:mc="http://schemas.openxmlformats.org/markup-compatibility/2006" xmlns:aink="http://schemas.microsoft.com/office/drawing/2016/ink" xmlns:am3d="http://schemas.microsoft.com/office/drawing/2017/model3d" xmlns:o="urn:schemas-microsoft-com:office:office" xmlns:r="http://schemas.openxmlformats.org/officeDocument/2006/relationships" xmlns:m="http://schemas.openxmlformats.org/officeDocument/2006/math" xmlns:v="urn:schemas-microsoft-com:vml" xmlns:wp14="http://schemas.microsoft.com/office/word/2010/wordprocessingDrawing" xmlns:wp="http://schemas.openxmlformats.org/drawingml/2006/wordprocessingDrawing" xmlns:w10="urn:schemas-microsoft-com:office:word" xmlns:w="http://schemas.openxmlformats.org/wordprocessingml/2006/main" xmlns:w14="http://schemas.microsoft.com/office/word/2010/wordml" xmlns:w15="http://schemas.microsoft.com/office/word/2012/wordml" xmlns:w16cid="http://schemas.microsoft.com/office/word/2016/wordml/cid" xmlns:w16se="http://schemas.microsoft.com/office/word/2015/wordml/symex" xmlns:wpg="http://schemas.microsoft.com/office/word/2010/wordprocessingGroup" xmlns:wpi="http://schemas.microsoft.com/office/word/2010/wordprocessingInk" xmlns:wne="http://schemas.microsoft.com/office/word/2006/wordml" xmlns:wps="http://schemas.microsoft.com/office/word/2010/wordprocessingShape" mc:Ignorable="w14 w15 w16se w16cid wp14">
+  <w:endnote w:type="separator" w:id="-1">
+    <w:p>
+      <w:pPr>
+        <w:spacing w:before="0" w:after="0"/>
+      </w:pPr>
+      <w:r>
+        <w:separator/>
+      </w:r>
+    </w:p>
+  </w:endnote>
+  <w:endnote w:type="continuationSeparator" w:id="0">
+    <w:p>
+      <w:pPr>
+        <w:spacing w:before="0" w:after="0"/>
+      </w:pPr>
+      <w:r>
+        <w:continuationSeparator/>
+      </w:r>
+    </w:p>
+  </w:endnote>
+</w:endnotes>
+</file>
+
+<file path=word/footnotes.xml><?xml version="1.0" encoding="utf-8"?>
+<w:footnotes xmlns:wpc="http://schemas.microsoft.com/office/word/2010/wordprocessingCanvas" xmlns:cx="http://schemas.microsoft.com/office/drawing/2014/chartex" xmlns:cx1="http://schemas.microsoft.com/office/drawing/2015/9/8/chartex" xmlns:cx2="http://schemas.microsoft.com/office/drawing/2015/10/21/chartex" xmlns:cx3="http://schemas.microsoft.com/office/drawing/2016/5/9/chartex" xmlns:cx4="http://schemas.microsoft.com/office/drawing/2016/5/10/chartex" xmlns:cx5="http://schemas.microsoft.com/office/drawing/2016/5/11/chartex" xmlns:cx6="http://schemas.microsoft.com/office/drawing/2016/5/12/chartex" xmlns:cx7="http://schemas.microsoft.com/office/drawing/2016/5/13/chartex" xmlns:cx8="http://schemas.microsoft.com/office/drawing/2016/5/14/chartex" xmlns:mc="http://schemas.openxmlformats.org/markup-compatibility/2006" xmlns:aink="http://schemas.microsoft.com/office/drawing/2016/ink" xmlns:am3d="http://schemas.microsoft.com/office/drawing/2017/model3d" xmlns:o="urn:schemas-microsoft-com:office:office" xmlns:r="http://schemas.openxmlformats.org/officeDocument/2006/relationships" xmlns:m="http://schemas.openxmlformats.org/officeDocument/2006/math" xmlns:v="urn:schemas-microsoft-com:vml" xmlns:wp14="http://schemas.microsoft.com/office/word/2010/wordprocessingDrawing" xmlns:wp="http://schemas.openxmlformats.org/drawingml/2006/wordprocessingDrawing" xmlns:w10="urn:schemas-microsoft-com:office:word" xmlns:w="http://schemas.openxmlformats.org/wordprocessingml/2006/main" xmlns:w14="http://schemas.microsoft.com/office/word/2010/wordml" xmlns:w15="http://schemas.microsoft.com/office/word/2012/wordml" xmlns:w16cid="http://schemas.microsoft.com/office/word/2016/wordml/cid" xmlns:w16se="http://schemas.microsoft.com/office/word/2015/wordml/symex" xmlns:wpg="http://schemas.microsoft.com/office/word/2010/wordprocessingGroup" xmlns:wpi="http://schemas.microsoft.com/office/word/2010/wordprocessingInk" xmlns:wne="http://schemas.microsoft.com/office/word/2006/wordml" xmlns:wps="http://schemas.microsoft.com/office/word/2010/wordprocessingShape" mc:Ignorable="w14 w15 w16se w16cid wp14">
+  <w:footnote w:type="separator" w:id="-1">
+    <w:p>
+      <w:pPr>
+        <w:spacing w:before="0" w:after="0"/>
+      </w:pPr>
+      <w:r>
+        <w:separator/>
+      </w:r>
+    </w:p>
+  </w:footnote>
+  <w:footnote w:type="continuationSeparator" w:id="0">
+    <w:p>
+      <w:pPr>
+        <w:spacing w:before="0" w:after="0"/>
+      </w:pPr>
+      <w:r>
+        <w:continuationSeparator/>
+      </w:r>
+    </w:p>
+  </w:footnote>
+</w:footnotes>
 </file>
 
 <file path=word/styles.xml><?xml version="1.0" encoding="utf-8"?>
@@ -7463,6 +7672,50 @@
       <w:szCs w:val="20"/>
     </w:rPr>
   </w:style>
+  <w:style w:type="paragraph" w:styleId="Header">
+    <w:name w:val="header"/>
+    <w:basedOn w:val="Normal"/>
+    <w:link w:val="HeaderChar"/>
+    <w:uiPriority w:val="99"/>
+    <w:unhideWhenUsed/>
+    <w:rsid w:val="00501FD8"/>
+    <w:pPr>
+      <w:tabs>
+        <w:tab w:val="center" w:pos="4680"/>
+        <w:tab w:val="right" w:pos="9360"/>
+      </w:tabs>
+      <w:spacing w:before="0" w:after="0"/>
+    </w:pPr>
+  </w:style>
+  <w:style w:type="character" w:customStyle="1" w:styleId="HeaderChar">
+    <w:name w:val="Header Char"/>
+    <w:basedOn w:val="DefaultParagraphFont"/>
+    <w:link w:val="Header"/>
+    <w:uiPriority w:val="99"/>
+    <w:rsid w:val="00501FD8"/>
+  </w:style>
+  <w:style w:type="paragraph" w:styleId="Footer">
+    <w:name w:val="footer"/>
+    <w:basedOn w:val="Normal"/>
+    <w:link w:val="FooterChar"/>
+    <w:uiPriority w:val="99"/>
+    <w:unhideWhenUsed/>
+    <w:rsid w:val="00501FD8"/>
+    <w:pPr>
+      <w:tabs>
+        <w:tab w:val="center" w:pos="4680"/>
+        <w:tab w:val="right" w:pos="9360"/>
+      </w:tabs>
+      <w:spacing w:before="0" w:after="0"/>
+    </w:pPr>
+  </w:style>
+  <w:style w:type="character" w:customStyle="1" w:styleId="FooterChar">
+    <w:name w:val="Footer Char"/>
+    <w:basedOn w:val="DefaultParagraphFont"/>
+    <w:link w:val="Footer"/>
+    <w:uiPriority w:val="99"/>
+    <w:rsid w:val="00501FD8"/>
+  </w:style>
 </w:styles>
 </file>
 
@@ -7791,7 +8044,7 @@
 </file>
 
 <file path=customXml/itemProps1.xml><?xml version="1.0" encoding="utf-8"?>
-<ds:datastoreItem xmlns:ds="http://schemas.openxmlformats.org/officeDocument/2006/customXml" ds:itemID="{379750D5-A1C7-6F43-AB4F-5E9B6F1B5FBA}">
+<ds:datastoreItem xmlns:ds="http://schemas.openxmlformats.org/officeDocument/2006/customXml" ds:itemID="{17E88F59-4ACD-154F-8AA1-4AABF1F49EF1}">
   <ds:schemaRefs>
     <ds:schemaRef ds:uri="http://schemas.openxmlformats.org/officeDocument/2006/bibliography"/>
   </ds:schemaRefs>

</xml_diff>